<commit_message>
feat: version portable, instalador, modulo config_personal y flujos seguros
</commit_message>
<xml_diff>
--- a/plantillas/xml.docx
+++ b/plantillas/xml.docx
@@ -5,18 +5,16 @@
     <w:p>
       <w:pPr>
         <w:rPr>
-          <w:rFonts w:ascii="Geomanist" w:hAnsi="Geomanist" w:cs="Geomanist"/>
+          <w:rFonts w:ascii="Geomanist Regular" w:hAnsi="Geomanist Regular" w:cs="Geomanist"/>
           <w:sz w:val="14"/>
           <w:szCs w:val="14"/>
-          <w:u w:val="single"/>
         </w:rPr>
       </w:pPr>
       <w:r>
         <w:rPr>
-          <w:rFonts w:ascii="Geomanist" w:eastAsia="Geomanist" w:hAnsi="Geomanist" w:cs="Geomanist"/>
+          <w:rFonts w:ascii="Geomanist Regular" w:eastAsia="Geomanist" w:hAnsi="Geomanist Regular" w:cs="Geomanist"/>
           <w:sz w:val="14"/>
           <w:szCs w:val="14"/>
-          <w:u w:val="single"/>
         </w:rPr>
         <w:t>{{XML}}</w:t>
       </w:r>
@@ -29,35 +27,6 @@
           <w:szCs w:val="14"/>
         </w:rPr>
       </w:pPr>
-    </w:p>
-    <w:p>
-      <w:pPr>
-        <w:rPr>
-          <w:rFonts w:ascii="Geomanist" w:hAnsi="Geomanist" w:cs="Geomanist"/>
-          <w:sz w:val="14"/>
-          <w:szCs w:val="14"/>
-        </w:rPr>
-      </w:pPr>
-    </w:p>
-    <w:p>
-      <w:pPr>
-        <w:tabs>
-          <w:tab w:val="left" w:pos="3700"/>
-        </w:tabs>
-        <w:rPr>
-          <w:rFonts w:ascii="Geomanist" w:hAnsi="Geomanist" w:cs="Geomanist"/>
-          <w:sz w:val="14"/>
-          <w:szCs w:val="14"/>
-        </w:rPr>
-      </w:pPr>
-      <w:r>
-        <w:rPr>
-          <w:rFonts w:ascii="Geomanist" w:hAnsi="Geomanist" w:cs="Geomanist"/>
-          <w:sz w:val="14"/>
-          <w:szCs w:val="14"/>
-        </w:rPr>
-        <w:tab/>
-      </w:r>
     </w:p>
     <w:sectPr>
       <w:pgSz w:w="11906" w:h="16838"/>

</xml_diff>